<commit_message>
Added my part of work to .docx
</commit_message>
<xml_diff>
--- a/dokumentacia.docx
+++ b/dokumentacia.docx
@@ -1,6 +1,6 @@
 
 <file path=word/document.xml><?xml version="1.0" encoding="utf-8"?>
-<w:document xmlns:wpc="http://schemas.microsoft.com/office/word/2010/wordprocessingCanvas" xmlns:cx="http://schemas.microsoft.com/office/drawing/2014/chartex" xmlns:cx1="http://schemas.microsoft.com/office/drawing/2015/9/8/chartex" xmlns:cx2="http://schemas.microsoft.com/office/drawing/2015/10/21/chartex" xmlns:cx3="http://schemas.microsoft.com/office/drawing/2016/5/9/chartex" xmlns:cx4="http://schemas.microsoft.com/office/drawing/2016/5/10/chartex" xmlns:cx5="http://schemas.microsoft.com/office/drawing/2016/5/11/chartex" xmlns:cx6="http://schemas.microsoft.com/office/drawing/2016/5/12/chartex" xmlns:cx7="http://schemas.microsoft.com/office/drawing/2016/5/13/chartex" xmlns:cx8="http://schemas.microsoft.com/office/drawing/2016/5/14/chartex" xmlns:mc="http://schemas.openxmlformats.org/markup-compatibility/2006" xmlns:aink="http://schemas.microsoft.com/office/drawing/2016/ink" xmlns:am3d="http://schemas.microsoft.com/office/drawing/2017/model3d" xmlns:o="urn:schemas-microsoft-com:office:office" xmlns:oel="http://schemas.microsoft.com/office/2019/extlst" xmlns:r="http://schemas.openxmlformats.org/officeDocument/2006/relationships" xmlns:m="http://schemas.openxmlformats.org/officeDocument/2006/math" xmlns:v="urn:schemas-microsoft-com:vml" xmlns:wp14="http://schemas.microsoft.com/office/word/2010/wordprocessingDrawing" xmlns:wp="http://schemas.openxmlformats.org/drawingml/2006/wordprocessingDrawing" xmlns:w10="urn:schemas-microsoft-com:office:word" xmlns:w="http://schemas.openxmlformats.org/wordprocessingml/2006/main" xmlns:w14="http://schemas.microsoft.com/office/word/2010/wordml" xmlns:w15="http://schemas.microsoft.com/office/word/2012/wordml" xmlns:w16cex="http://schemas.microsoft.com/office/word/2018/wordml/cex" xmlns:w16cid="http://schemas.microsoft.com/office/word/2016/wordml/cid" xmlns:w16="http://schemas.microsoft.com/office/word/2018/wordml" xmlns:w16du="http://schemas.microsoft.com/office/word/2023/wordml/word16du" xmlns:w16sdtdh="http://schemas.microsoft.com/office/word/2020/wordml/sdtdatahash" xmlns:w16sdtfl="http://schemas.microsoft.com/office/word/2024/wordml/sdtformatlock" xmlns:w16se="http://schemas.microsoft.com/office/word/2015/wordml/symex" xmlns:wpg="http://schemas.microsoft.com/office/word/2010/wordprocessingGroup" xmlns:wpi="http://schemas.microsoft.com/office/word/2010/wordprocessingInk" xmlns:wne="http://schemas.microsoft.com/office/word/2006/wordml" xmlns:wps="http://schemas.microsoft.com/office/word/2010/wordprocessingShape" mc:Ignorable="w14 w15 w16se w16cid w16 w16cex w16sdtdh w16sdtfl w16du wp14">
+<w:document xmlns:wpc="http://schemas.microsoft.com/office/word/2010/wordprocessingCanvas" xmlns:cx="http://schemas.microsoft.com/office/drawing/2014/chartex" xmlns:cx1="http://schemas.microsoft.com/office/drawing/2015/9/8/chartex" xmlns:cx2="http://schemas.microsoft.com/office/drawing/2015/10/21/chartex" xmlns:cx3="http://schemas.microsoft.com/office/drawing/2016/5/9/chartex" xmlns:cx4="http://schemas.microsoft.com/office/drawing/2016/5/10/chartex" xmlns:cx5="http://schemas.microsoft.com/office/drawing/2016/5/11/chartex" xmlns:cx6="http://schemas.microsoft.com/office/drawing/2016/5/12/chartex" xmlns:cx7="http://schemas.microsoft.com/office/drawing/2016/5/13/chartex" xmlns:cx8="http://schemas.microsoft.com/office/drawing/2016/5/14/chartex" xmlns:mc="http://schemas.openxmlformats.org/markup-compatibility/2006" xmlns:m="http://schemas.openxmlformats.org/officeDocument/2006/math" xmlns:aink="http://schemas.microsoft.com/office/drawing/2016/ink" xmlns:am3d="http://schemas.microsoft.com/office/drawing/2017/model3d" xmlns:oel="http://schemas.microsoft.com/office/2019/extlst" xmlns:r="http://schemas.openxmlformats.org/officeDocument/2006/relationships" xmlns:wp14="http://schemas.microsoft.com/office/word/2010/wordprocessingDrawing" xmlns:wp="http://schemas.openxmlformats.org/drawingml/2006/wordprocessingDrawing" xmlns:wpg="http://schemas.microsoft.com/office/word/2010/wordprocessingGroup" xmlns:wpi="http://schemas.microsoft.com/office/word/2010/wordprocessingInk" xmlns:wps="http://schemas.microsoft.com/office/word/2010/wordprocessingShape" xmlns:o="urn:schemas-microsoft-com:office:office" xmlns:v="urn:schemas-microsoft-com:vml" xmlns:w10="urn:schemas-microsoft-com:office:word" xmlns:w="http://schemas.openxmlformats.org/wordprocessingml/2006/main" xmlns:w14="http://schemas.microsoft.com/office/word/2010/wordml" xmlns:w15="http://schemas.microsoft.com/office/word/2012/wordml" xmlns:w16cex="http://schemas.microsoft.com/office/word/2018/wordml/cex" xmlns:w16cid="http://schemas.microsoft.com/office/word/2016/wordml/cid" xmlns:w16="http://schemas.microsoft.com/office/word/2018/wordml" xmlns:w16sdtdh="http://schemas.microsoft.com/office/word/2020/wordml/sdtdatahash" xmlns:w16sdtfl="http://schemas.microsoft.com/office/word/2024/wordml/sdtformatlock" xmlns:w16se="http://schemas.microsoft.com/office/word/2015/wordml/symex" xmlns:w16du="http://schemas.microsoft.com/office/word/2023/wordml/word16du" xmlns:wne="http://schemas.microsoft.com/office/word/2006/wordml" mc:Ignorable="w14 w15 w16se w16cid w16 w16cex w16sdtdh w16sdtfl w16du wp14">
   <w:body>
     <w:p>
       <w:pPr>
@@ -202,6 +202,217 @@
         <w:br w:type="page"/>
       </w:r>
     </w:p>
+    <w:p/>
+    <w:p>
+      <w:pPr>
+        <w:pStyle w:val="SPnadpis"/>
+      </w:pPr>
+      <w:r>
+        <w:t xml:space="preserve">Popis modelu </w:t>
+      </w:r>
+    </w:p>
+    <w:p>
+      <w:pPr>
+        <w:pStyle w:val="SPnadpis"/>
+      </w:pPr>
+    </w:p>
+    <w:p>
+      <w:pPr>
+        <w:pStyle w:val="SPtext"/>
+      </w:pPr>
+      <w:r>
+        <w:t xml:space="preserve">Model Pac-Man v knižnici </w:t>
+      </w:r>
+      <w:proofErr w:type="spellStart"/>
+      <w:r>
+        <w:t>Models</w:t>
+      </w:r>
+      <w:proofErr w:type="spellEnd"/>
+      <w:r>
+        <w:t xml:space="preserve"> </w:t>
+      </w:r>
+      <w:proofErr w:type="spellStart"/>
+      <w:r>
+        <w:t>Library</w:t>
+      </w:r>
+      <w:proofErr w:type="spellEnd"/>
+      <w:r>
+        <w:t xml:space="preserve"> v sekcii </w:t>
+      </w:r>
+      <w:proofErr w:type="spellStart"/>
+      <w:r>
+        <w:t>Games</w:t>
+      </w:r>
+      <w:proofErr w:type="spellEnd"/>
+      <w:r>
+        <w:t xml:space="preserve"> je súčasťou </w:t>
+      </w:r>
+      <w:proofErr w:type="spellStart"/>
+      <w:r>
+        <w:t>NetLogo</w:t>
+      </w:r>
+      <w:proofErr w:type="spellEnd"/>
+      <w:r>
+        <w:t xml:space="preserve">. </w:t>
+      </w:r>
+      <w:r>
+        <w:t>Ide o klasickú arkádovú hru Pac-Man, v ktorej prechádzaš cez bludisko a snažíš sa zjesť všetky „</w:t>
+      </w:r>
+      <w:proofErr w:type="spellStart"/>
+      <w:r>
+        <w:t>pellets</w:t>
+      </w:r>
+      <w:proofErr w:type="spellEnd"/>
+      <w:r>
+        <w:t>“ (malé guličky</w:t>
+      </w:r>
+      <w:r>
+        <w:t>). P</w:t>
+      </w:r>
+      <w:r>
+        <w:t xml:space="preserve">opri </w:t>
+      </w:r>
+      <w:r>
+        <w:t>tom</w:t>
+      </w:r>
+      <w:r>
+        <w:t xml:space="preserve"> ťa naháňajú </w:t>
+      </w:r>
+      <w:r>
+        <w:t xml:space="preserve">a chcú zjesť </w:t>
+      </w:r>
+      <w:r>
+        <w:t>duchovia.</w:t>
+      </w:r>
+      <w:r>
+        <w:t xml:space="preserve"> Úspešnosť sa meria v skóre a počtom zostávajúcich </w:t>
+      </w:r>
+      <w:proofErr w:type="spellStart"/>
+      <w:r>
+        <w:t>životou</w:t>
+      </w:r>
+      <w:proofErr w:type="spellEnd"/>
+      <w:r>
+        <w:t>.</w:t>
+      </w:r>
+      <w:r>
+        <w:t xml:space="preserve"> To znamená že nejde o</w:t>
+      </w:r>
+      <w:r>
+        <w:t> </w:t>
+      </w:r>
+      <w:r>
+        <w:t>simuláciu</w:t>
+      </w:r>
+      <w:r>
+        <w:t xml:space="preserve"> na</w:t>
+      </w:r>
+      <w:r>
+        <w:t xml:space="preserve"> sled</w:t>
+      </w:r>
+      <w:r>
+        <w:t>ovanie</w:t>
+      </w:r>
+      <w:r>
+        <w:t xml:space="preserve">, ale o hru ktorú hráš. </w:t>
+      </w:r>
+      <w:r>
+        <w:t>K modelu patrí aj Pac-Man Level Editor, v ktorom sa dajú upravovať a tvoriť levely.</w:t>
+      </w:r>
+    </w:p>
+    <w:p>
+      <w:pPr>
+        <w:pStyle w:val="SPtext"/>
+      </w:pPr>
+      <w:r>
+        <w:t>Pravidlá hry sú:</w:t>
+      </w:r>
+    </w:p>
+    <w:p>
+      <w:pPr>
+        <w:pStyle w:val="SPtext"/>
+        <w:numPr>
+          <w:ilvl w:val="0"/>
+          <w:numId w:val="2"/>
+        </w:numPr>
+      </w:pPr>
+      <w:r>
+        <w:t>Ak ťa duch chytí (zje) tak si prehral a opakuješ level pokiaľ máš dostatočný počet životov</w:t>
+      </w:r>
+    </w:p>
+    <w:p>
+      <w:pPr>
+        <w:pStyle w:val="SPtext"/>
+        <w:numPr>
+          <w:ilvl w:val="0"/>
+          <w:numId w:val="2"/>
+        </w:numPr>
+      </w:pPr>
+      <w:r>
+        <w:t>Keď</w:t>
+      </w:r>
+      <w:r>
+        <w:t xml:space="preserve"> Pac-Man zje „</w:t>
+      </w:r>
+      <w:proofErr w:type="spellStart"/>
+      <w:r>
+        <w:t>Power-pellet</w:t>
+      </w:r>
+      <w:proofErr w:type="spellEnd"/>
+      <w:r>
+        <w:t>“</w:t>
+      </w:r>
+      <w:r>
+        <w:t xml:space="preserve"> (veľká gulička)</w:t>
+      </w:r>
+      <w:r>
+        <w:t xml:space="preserve"> tak môže Pac-Man zjesť duchov, </w:t>
+      </w:r>
+      <w:r>
+        <w:t>tí</w:t>
+      </w:r>
+      <w:r>
+        <w:t xml:space="preserve"> sa ho zľaknú a </w:t>
+      </w:r>
+      <w:r>
+        <w:t>utekajú</w:t>
+      </w:r>
+      <w:r>
+        <w:t xml:space="preserve"> od neho</w:t>
+      </w:r>
+    </w:p>
+    <w:p>
+      <w:pPr>
+        <w:pStyle w:val="SPtext"/>
+        <w:numPr>
+          <w:ilvl w:val="0"/>
+          <w:numId w:val="2"/>
+        </w:numPr>
+      </w:pPr>
+      <w:r>
+        <w:t>Bonus ktorý sa objaví na krátku chvíľu, dáva veľký počet skóre</w:t>
+      </w:r>
+    </w:p>
+    <w:p>
+      <w:pPr>
+        <w:pStyle w:val="SPtext"/>
+        <w:numPr>
+          <w:ilvl w:val="0"/>
+          <w:numId w:val="2"/>
+        </w:numPr>
+      </w:pPr>
+      <w:r>
+        <w:t xml:space="preserve">Po vyzbieraní všetkých </w:t>
+      </w:r>
+      <w:proofErr w:type="spellStart"/>
+      <w:r>
+        <w:t>pellets</w:t>
+      </w:r>
+      <w:proofErr w:type="spellEnd"/>
+      <w:r>
+        <w:t xml:space="preserve"> sa posúvaš do ďalšieho levelu (bludiska)</w:t>
+      </w:r>
+    </w:p>
     <w:sectPr>
       <w:headerReference w:type="default" r:id="rId8"/>
       <w:footerReference w:type="default" r:id="rId9"/>
@@ -216,7 +427,7 @@
 </file>
 
 <file path=word/endnotes.xml><?xml version="1.0" encoding="utf-8"?>
-<w:endnotes xmlns:wpc="http://schemas.microsoft.com/office/word/2010/wordprocessingCanvas" xmlns:cx="http://schemas.microsoft.com/office/drawing/2014/chartex" xmlns:cx1="http://schemas.microsoft.com/office/drawing/2015/9/8/chartex" xmlns:cx2="http://schemas.microsoft.com/office/drawing/2015/10/21/chartex" xmlns:cx3="http://schemas.microsoft.com/office/drawing/2016/5/9/chartex" xmlns:cx4="http://schemas.microsoft.com/office/drawing/2016/5/10/chartex" xmlns:cx5="http://schemas.microsoft.com/office/drawing/2016/5/11/chartex" xmlns:cx6="http://schemas.microsoft.com/office/drawing/2016/5/12/chartex" xmlns:cx7="http://schemas.microsoft.com/office/drawing/2016/5/13/chartex" xmlns:cx8="http://schemas.microsoft.com/office/drawing/2016/5/14/chartex" xmlns:mc="http://schemas.openxmlformats.org/markup-compatibility/2006" xmlns:aink="http://schemas.microsoft.com/office/drawing/2016/ink" xmlns:am3d="http://schemas.microsoft.com/office/drawing/2017/model3d" xmlns:o="urn:schemas-microsoft-com:office:office" xmlns:oel="http://schemas.microsoft.com/office/2019/extlst" xmlns:r="http://schemas.openxmlformats.org/officeDocument/2006/relationships" xmlns:m="http://schemas.openxmlformats.org/officeDocument/2006/math" xmlns:v="urn:schemas-microsoft-com:vml" xmlns:wp14="http://schemas.microsoft.com/office/word/2010/wordprocessingDrawing" xmlns:wp="http://schemas.openxmlformats.org/drawingml/2006/wordprocessingDrawing" xmlns:w10="urn:schemas-microsoft-com:office:word" xmlns:w="http://schemas.openxmlformats.org/wordprocessingml/2006/main" xmlns:w14="http://schemas.microsoft.com/office/word/2010/wordml" xmlns:w15="http://schemas.microsoft.com/office/word/2012/wordml" xmlns:w16cex="http://schemas.microsoft.com/office/word/2018/wordml/cex" xmlns:w16cid="http://schemas.microsoft.com/office/word/2016/wordml/cid" xmlns:w16="http://schemas.microsoft.com/office/word/2018/wordml" xmlns:w16du="http://schemas.microsoft.com/office/word/2023/wordml/word16du" xmlns:w16sdtdh="http://schemas.microsoft.com/office/word/2020/wordml/sdtdatahash" xmlns:w16sdtfl="http://schemas.microsoft.com/office/word/2024/wordml/sdtformatlock" xmlns:w16se="http://schemas.microsoft.com/office/word/2015/wordml/symex" xmlns:wpg="http://schemas.microsoft.com/office/word/2010/wordprocessingGroup" xmlns:wpi="http://schemas.microsoft.com/office/word/2010/wordprocessingInk" xmlns:wne="http://schemas.microsoft.com/office/word/2006/wordml" xmlns:wps="http://schemas.microsoft.com/office/word/2010/wordprocessingShape" mc:Ignorable="w14 w15 w16se w16cid w16 w16cex w16sdtdh w16sdtfl w16du wp14">
+<w:endnotes xmlns:wpc="http://schemas.microsoft.com/office/word/2010/wordprocessingCanvas" xmlns:cx="http://schemas.microsoft.com/office/drawing/2014/chartex" xmlns:cx1="http://schemas.microsoft.com/office/drawing/2015/9/8/chartex" xmlns:cx2="http://schemas.microsoft.com/office/drawing/2015/10/21/chartex" xmlns:cx3="http://schemas.microsoft.com/office/drawing/2016/5/9/chartex" xmlns:cx4="http://schemas.microsoft.com/office/drawing/2016/5/10/chartex" xmlns:cx5="http://schemas.microsoft.com/office/drawing/2016/5/11/chartex" xmlns:cx6="http://schemas.microsoft.com/office/drawing/2016/5/12/chartex" xmlns:cx7="http://schemas.microsoft.com/office/drawing/2016/5/13/chartex" xmlns:cx8="http://schemas.microsoft.com/office/drawing/2016/5/14/chartex" xmlns:mc="http://schemas.openxmlformats.org/markup-compatibility/2006" xmlns:m="http://schemas.openxmlformats.org/officeDocument/2006/math" xmlns:aink="http://schemas.microsoft.com/office/drawing/2016/ink" xmlns:am3d="http://schemas.microsoft.com/office/drawing/2017/model3d" xmlns:oel="http://schemas.microsoft.com/office/2019/extlst" xmlns:r="http://schemas.openxmlformats.org/officeDocument/2006/relationships" xmlns:wp14="http://schemas.microsoft.com/office/word/2010/wordprocessingDrawing" xmlns:wp="http://schemas.openxmlformats.org/drawingml/2006/wordprocessingDrawing" xmlns:wpg="http://schemas.microsoft.com/office/word/2010/wordprocessingGroup" xmlns:wpi="http://schemas.microsoft.com/office/word/2010/wordprocessingInk" xmlns:wps="http://schemas.microsoft.com/office/word/2010/wordprocessingShape" xmlns:o="urn:schemas-microsoft-com:office:office" xmlns:v="urn:schemas-microsoft-com:vml" xmlns:w10="urn:schemas-microsoft-com:office:word" xmlns:w="http://schemas.openxmlformats.org/wordprocessingml/2006/main" xmlns:w14="http://schemas.microsoft.com/office/word/2010/wordml" xmlns:w15="http://schemas.microsoft.com/office/word/2012/wordml" xmlns:w16cex="http://schemas.microsoft.com/office/word/2018/wordml/cex" xmlns:w16cid="http://schemas.microsoft.com/office/word/2016/wordml/cid" xmlns:w16="http://schemas.microsoft.com/office/word/2018/wordml" xmlns:w16sdtdh="http://schemas.microsoft.com/office/word/2020/wordml/sdtdatahash" xmlns:w16sdtfl="http://schemas.microsoft.com/office/word/2024/wordml/sdtformatlock" xmlns:w16se="http://schemas.microsoft.com/office/word/2015/wordml/symex" xmlns:w16du="http://schemas.microsoft.com/office/word/2023/wordml/word16du" xmlns:wne="http://schemas.microsoft.com/office/word/2006/wordml" mc:Ignorable="w14 w15 w16se w16cid w16 w16cex w16sdtdh w16sdtfl w16du wp14">
   <w:endnote w:type="separator" w:id="-1">
     <w:p>
       <w:r>
@@ -235,7 +446,7 @@
 </file>
 
 <file path=word/footer1.xml><?xml version="1.0" encoding="utf-8"?>
-<w:ftr xmlns:wpc="http://schemas.microsoft.com/office/word/2010/wordprocessingCanvas" xmlns:cx="http://schemas.microsoft.com/office/drawing/2014/chartex" xmlns:cx1="http://schemas.microsoft.com/office/drawing/2015/9/8/chartex" xmlns:cx2="http://schemas.microsoft.com/office/drawing/2015/10/21/chartex" xmlns:cx3="http://schemas.microsoft.com/office/drawing/2016/5/9/chartex" xmlns:cx4="http://schemas.microsoft.com/office/drawing/2016/5/10/chartex" xmlns:cx5="http://schemas.microsoft.com/office/drawing/2016/5/11/chartex" xmlns:cx6="http://schemas.microsoft.com/office/drawing/2016/5/12/chartex" xmlns:cx7="http://schemas.microsoft.com/office/drawing/2016/5/13/chartex" xmlns:cx8="http://schemas.microsoft.com/office/drawing/2016/5/14/chartex" xmlns:mc="http://schemas.openxmlformats.org/markup-compatibility/2006" xmlns:aink="http://schemas.microsoft.com/office/drawing/2016/ink" xmlns:am3d="http://schemas.microsoft.com/office/drawing/2017/model3d" xmlns:o="urn:schemas-microsoft-com:office:office" xmlns:oel="http://schemas.microsoft.com/office/2019/extlst" xmlns:r="http://schemas.openxmlformats.org/officeDocument/2006/relationships" xmlns:m="http://schemas.openxmlformats.org/officeDocument/2006/math" xmlns:v="urn:schemas-microsoft-com:vml" xmlns:wp14="http://schemas.microsoft.com/office/word/2010/wordprocessingDrawing" xmlns:wp="http://schemas.openxmlformats.org/drawingml/2006/wordprocessingDrawing" xmlns:w10="urn:schemas-microsoft-com:office:word" xmlns:w="http://schemas.openxmlformats.org/wordprocessingml/2006/main" xmlns:w14="http://schemas.microsoft.com/office/word/2010/wordml" xmlns:w15="http://schemas.microsoft.com/office/word/2012/wordml" xmlns:w16cex="http://schemas.microsoft.com/office/word/2018/wordml/cex" xmlns:w16cid="http://schemas.microsoft.com/office/word/2016/wordml/cid" xmlns:w16="http://schemas.microsoft.com/office/word/2018/wordml" xmlns:w16du="http://schemas.microsoft.com/office/word/2023/wordml/word16du" xmlns:w16sdtdh="http://schemas.microsoft.com/office/word/2020/wordml/sdtdatahash" xmlns:w16sdtfl="http://schemas.microsoft.com/office/word/2024/wordml/sdtformatlock" xmlns:w16se="http://schemas.microsoft.com/office/word/2015/wordml/symex" xmlns:wpg="http://schemas.microsoft.com/office/word/2010/wordprocessingGroup" xmlns:wpi="http://schemas.microsoft.com/office/word/2010/wordprocessingInk" xmlns:wne="http://schemas.microsoft.com/office/word/2006/wordml" xmlns:wps="http://schemas.microsoft.com/office/word/2010/wordprocessingShape" mc:Ignorable="w14 w15 w16se w16cid w16 w16cex w16sdtdh w16sdtfl w16du wp14">
+<w:ftr xmlns:wpc="http://schemas.microsoft.com/office/word/2010/wordprocessingCanvas" xmlns:cx="http://schemas.microsoft.com/office/drawing/2014/chartex" xmlns:cx1="http://schemas.microsoft.com/office/drawing/2015/9/8/chartex" xmlns:cx2="http://schemas.microsoft.com/office/drawing/2015/10/21/chartex" xmlns:cx3="http://schemas.microsoft.com/office/drawing/2016/5/9/chartex" xmlns:cx4="http://schemas.microsoft.com/office/drawing/2016/5/10/chartex" xmlns:cx5="http://schemas.microsoft.com/office/drawing/2016/5/11/chartex" xmlns:cx6="http://schemas.microsoft.com/office/drawing/2016/5/12/chartex" xmlns:cx7="http://schemas.microsoft.com/office/drawing/2016/5/13/chartex" xmlns:cx8="http://schemas.microsoft.com/office/drawing/2016/5/14/chartex" xmlns:mc="http://schemas.openxmlformats.org/markup-compatibility/2006" xmlns:m="http://schemas.openxmlformats.org/officeDocument/2006/math" xmlns:aink="http://schemas.microsoft.com/office/drawing/2016/ink" xmlns:am3d="http://schemas.microsoft.com/office/drawing/2017/model3d" xmlns:oel="http://schemas.microsoft.com/office/2019/extlst" xmlns:r="http://schemas.openxmlformats.org/officeDocument/2006/relationships" xmlns:wp14="http://schemas.microsoft.com/office/word/2010/wordprocessingDrawing" xmlns:wp="http://schemas.openxmlformats.org/drawingml/2006/wordprocessingDrawing" xmlns:wpg="http://schemas.microsoft.com/office/word/2010/wordprocessingGroup" xmlns:wpi="http://schemas.microsoft.com/office/word/2010/wordprocessingInk" xmlns:wps="http://schemas.microsoft.com/office/word/2010/wordprocessingShape" xmlns:o="urn:schemas-microsoft-com:office:office" xmlns:v="urn:schemas-microsoft-com:vml" xmlns:w10="urn:schemas-microsoft-com:office:word" xmlns:w="http://schemas.openxmlformats.org/wordprocessingml/2006/main" xmlns:w14="http://schemas.microsoft.com/office/word/2010/wordml" xmlns:w15="http://schemas.microsoft.com/office/word/2012/wordml" xmlns:w16cex="http://schemas.microsoft.com/office/word/2018/wordml/cex" xmlns:w16cid="http://schemas.microsoft.com/office/word/2016/wordml/cid" xmlns:w16="http://schemas.microsoft.com/office/word/2018/wordml" xmlns:w16sdtdh="http://schemas.microsoft.com/office/word/2020/wordml/sdtdatahash" xmlns:w16sdtfl="http://schemas.microsoft.com/office/word/2024/wordml/sdtformatlock" xmlns:w16se="http://schemas.microsoft.com/office/word/2015/wordml/symex" xmlns:w16du="http://schemas.microsoft.com/office/word/2023/wordml/word16du" xmlns:wne="http://schemas.microsoft.com/office/word/2006/wordml" mc:Ignorable="w14 w15 w16se w16cid w16 w16cex w16sdtdh w16sdtfl w16du wp14">
   <w:sdt>
     <w:sdtPr>
       <w:id w:val="-1555537685"/>
@@ -247,7 +458,7 @@
     <w:sdtContent>
       <w:p>
         <w:pPr>
-          <w:pStyle w:val="Pta"/>
+          <w:pStyle w:val="Footer"/>
           <w:jc w:val="center"/>
         </w:pPr>
         <w:r>
@@ -270,14 +481,14 @@
   </w:sdt>
   <w:p>
     <w:pPr>
-      <w:pStyle w:val="Pta"/>
+      <w:pStyle w:val="Footer"/>
     </w:pPr>
   </w:p>
 </w:ftr>
 </file>
 
 <file path=word/footnotes.xml><?xml version="1.0" encoding="utf-8"?>
-<w:footnotes xmlns:wpc="http://schemas.microsoft.com/office/word/2010/wordprocessingCanvas" xmlns:cx="http://schemas.microsoft.com/office/drawing/2014/chartex" xmlns:cx1="http://schemas.microsoft.com/office/drawing/2015/9/8/chartex" xmlns:cx2="http://schemas.microsoft.com/office/drawing/2015/10/21/chartex" xmlns:cx3="http://schemas.microsoft.com/office/drawing/2016/5/9/chartex" xmlns:cx4="http://schemas.microsoft.com/office/drawing/2016/5/10/chartex" xmlns:cx5="http://schemas.microsoft.com/office/drawing/2016/5/11/chartex" xmlns:cx6="http://schemas.microsoft.com/office/drawing/2016/5/12/chartex" xmlns:cx7="http://schemas.microsoft.com/office/drawing/2016/5/13/chartex" xmlns:cx8="http://schemas.microsoft.com/office/drawing/2016/5/14/chartex" xmlns:mc="http://schemas.openxmlformats.org/markup-compatibility/2006" xmlns:aink="http://schemas.microsoft.com/office/drawing/2016/ink" xmlns:am3d="http://schemas.microsoft.com/office/drawing/2017/model3d" xmlns:o="urn:schemas-microsoft-com:office:office" xmlns:oel="http://schemas.microsoft.com/office/2019/extlst" xmlns:r="http://schemas.openxmlformats.org/officeDocument/2006/relationships" xmlns:m="http://schemas.openxmlformats.org/officeDocument/2006/math" xmlns:v="urn:schemas-microsoft-com:vml" xmlns:wp14="http://schemas.microsoft.com/office/word/2010/wordprocessingDrawing" xmlns:wp="http://schemas.openxmlformats.org/drawingml/2006/wordprocessingDrawing" xmlns:w10="urn:schemas-microsoft-com:office:word" xmlns:w="http://schemas.openxmlformats.org/wordprocessingml/2006/main" xmlns:w14="http://schemas.microsoft.com/office/word/2010/wordml" xmlns:w15="http://schemas.microsoft.com/office/word/2012/wordml" xmlns:w16cex="http://schemas.microsoft.com/office/word/2018/wordml/cex" xmlns:w16cid="http://schemas.microsoft.com/office/word/2016/wordml/cid" xmlns:w16="http://schemas.microsoft.com/office/word/2018/wordml" xmlns:w16du="http://schemas.microsoft.com/office/word/2023/wordml/word16du" xmlns:w16sdtdh="http://schemas.microsoft.com/office/word/2020/wordml/sdtdatahash" xmlns:w16sdtfl="http://schemas.microsoft.com/office/word/2024/wordml/sdtformatlock" xmlns:w16se="http://schemas.microsoft.com/office/word/2015/wordml/symex" xmlns:wpg="http://schemas.microsoft.com/office/word/2010/wordprocessingGroup" xmlns:wpi="http://schemas.microsoft.com/office/word/2010/wordprocessingInk" xmlns:wne="http://schemas.microsoft.com/office/word/2006/wordml" xmlns:wps="http://schemas.microsoft.com/office/word/2010/wordprocessingShape" mc:Ignorable="w14 w15 w16se w16cid w16 w16cex w16sdtdh w16sdtfl w16du wp14">
+<w:footnotes xmlns:wpc="http://schemas.microsoft.com/office/word/2010/wordprocessingCanvas" xmlns:cx="http://schemas.microsoft.com/office/drawing/2014/chartex" xmlns:cx1="http://schemas.microsoft.com/office/drawing/2015/9/8/chartex" xmlns:cx2="http://schemas.microsoft.com/office/drawing/2015/10/21/chartex" xmlns:cx3="http://schemas.microsoft.com/office/drawing/2016/5/9/chartex" xmlns:cx4="http://schemas.microsoft.com/office/drawing/2016/5/10/chartex" xmlns:cx5="http://schemas.microsoft.com/office/drawing/2016/5/11/chartex" xmlns:cx6="http://schemas.microsoft.com/office/drawing/2016/5/12/chartex" xmlns:cx7="http://schemas.microsoft.com/office/drawing/2016/5/13/chartex" xmlns:cx8="http://schemas.microsoft.com/office/drawing/2016/5/14/chartex" xmlns:mc="http://schemas.openxmlformats.org/markup-compatibility/2006" xmlns:m="http://schemas.openxmlformats.org/officeDocument/2006/math" xmlns:aink="http://schemas.microsoft.com/office/drawing/2016/ink" xmlns:am3d="http://schemas.microsoft.com/office/drawing/2017/model3d" xmlns:oel="http://schemas.microsoft.com/office/2019/extlst" xmlns:r="http://schemas.openxmlformats.org/officeDocument/2006/relationships" xmlns:wp14="http://schemas.microsoft.com/office/word/2010/wordprocessingDrawing" xmlns:wp="http://schemas.openxmlformats.org/drawingml/2006/wordprocessingDrawing" xmlns:wpg="http://schemas.microsoft.com/office/word/2010/wordprocessingGroup" xmlns:wpi="http://schemas.microsoft.com/office/word/2010/wordprocessingInk" xmlns:wps="http://schemas.microsoft.com/office/word/2010/wordprocessingShape" xmlns:o="urn:schemas-microsoft-com:office:office" xmlns:v="urn:schemas-microsoft-com:vml" xmlns:w10="urn:schemas-microsoft-com:office:word" xmlns:w="http://schemas.openxmlformats.org/wordprocessingml/2006/main" xmlns:w14="http://schemas.microsoft.com/office/word/2010/wordml" xmlns:w15="http://schemas.microsoft.com/office/word/2012/wordml" xmlns:w16cex="http://schemas.microsoft.com/office/word/2018/wordml/cex" xmlns:w16cid="http://schemas.microsoft.com/office/word/2016/wordml/cid" xmlns:w16="http://schemas.microsoft.com/office/word/2018/wordml" xmlns:w16sdtdh="http://schemas.microsoft.com/office/word/2020/wordml/sdtdatahash" xmlns:w16sdtfl="http://schemas.microsoft.com/office/word/2024/wordml/sdtformatlock" xmlns:w16se="http://schemas.microsoft.com/office/word/2015/wordml/symex" xmlns:w16du="http://schemas.microsoft.com/office/word/2023/wordml/word16du" xmlns:wne="http://schemas.microsoft.com/office/word/2006/wordml" mc:Ignorable="w14 w15 w16se w16cid w16 w16cex w16sdtdh w16sdtfl w16du wp14">
   <w:footnote w:type="separator" w:id="-1">
     <w:p>
       <w:r>
@@ -296,7 +507,7 @@
 </file>
 
 <file path=word/header1.xml><?xml version="1.0" encoding="utf-8"?>
-<w:hdr xmlns:wpc="http://schemas.microsoft.com/office/word/2010/wordprocessingCanvas" xmlns:cx="http://schemas.microsoft.com/office/drawing/2014/chartex" xmlns:cx1="http://schemas.microsoft.com/office/drawing/2015/9/8/chartex" xmlns:cx2="http://schemas.microsoft.com/office/drawing/2015/10/21/chartex" xmlns:cx3="http://schemas.microsoft.com/office/drawing/2016/5/9/chartex" xmlns:cx4="http://schemas.microsoft.com/office/drawing/2016/5/10/chartex" xmlns:cx5="http://schemas.microsoft.com/office/drawing/2016/5/11/chartex" xmlns:cx6="http://schemas.microsoft.com/office/drawing/2016/5/12/chartex" xmlns:cx7="http://schemas.microsoft.com/office/drawing/2016/5/13/chartex" xmlns:cx8="http://schemas.microsoft.com/office/drawing/2016/5/14/chartex" xmlns:mc="http://schemas.openxmlformats.org/markup-compatibility/2006" xmlns:aink="http://schemas.microsoft.com/office/drawing/2016/ink" xmlns:am3d="http://schemas.microsoft.com/office/drawing/2017/model3d" xmlns:o="urn:schemas-microsoft-com:office:office" xmlns:oel="http://schemas.microsoft.com/office/2019/extlst" xmlns:r="http://schemas.openxmlformats.org/officeDocument/2006/relationships" xmlns:m="http://schemas.openxmlformats.org/officeDocument/2006/math" xmlns:v="urn:schemas-microsoft-com:vml" xmlns:wp14="http://schemas.microsoft.com/office/word/2010/wordprocessingDrawing" xmlns:wp="http://schemas.openxmlformats.org/drawingml/2006/wordprocessingDrawing" xmlns:w10="urn:schemas-microsoft-com:office:word" xmlns:w="http://schemas.openxmlformats.org/wordprocessingml/2006/main" xmlns:w14="http://schemas.microsoft.com/office/word/2010/wordml" xmlns:w15="http://schemas.microsoft.com/office/word/2012/wordml" xmlns:w16cex="http://schemas.microsoft.com/office/word/2018/wordml/cex" xmlns:w16cid="http://schemas.microsoft.com/office/word/2016/wordml/cid" xmlns:w16="http://schemas.microsoft.com/office/word/2018/wordml" xmlns:w16du="http://schemas.microsoft.com/office/word/2023/wordml/word16du" xmlns:w16sdtdh="http://schemas.microsoft.com/office/word/2020/wordml/sdtdatahash" xmlns:w16sdtfl="http://schemas.microsoft.com/office/word/2024/wordml/sdtformatlock" xmlns:w16se="http://schemas.microsoft.com/office/word/2015/wordml/symex" xmlns:wpg="http://schemas.microsoft.com/office/word/2010/wordprocessingGroup" xmlns:wpi="http://schemas.microsoft.com/office/word/2010/wordprocessingInk" xmlns:wne="http://schemas.microsoft.com/office/word/2006/wordml" xmlns:wps="http://schemas.microsoft.com/office/word/2010/wordprocessingShape" mc:Ignorable="w14 w15 w16se w16cid w16 w16cex w16sdtdh w16sdtfl w16du wp14">
+<w:hdr xmlns:wpc="http://schemas.microsoft.com/office/word/2010/wordprocessingCanvas" xmlns:cx="http://schemas.microsoft.com/office/drawing/2014/chartex" xmlns:cx1="http://schemas.microsoft.com/office/drawing/2015/9/8/chartex" xmlns:cx2="http://schemas.microsoft.com/office/drawing/2015/10/21/chartex" xmlns:cx3="http://schemas.microsoft.com/office/drawing/2016/5/9/chartex" xmlns:cx4="http://schemas.microsoft.com/office/drawing/2016/5/10/chartex" xmlns:cx5="http://schemas.microsoft.com/office/drawing/2016/5/11/chartex" xmlns:cx6="http://schemas.microsoft.com/office/drawing/2016/5/12/chartex" xmlns:cx7="http://schemas.microsoft.com/office/drawing/2016/5/13/chartex" xmlns:cx8="http://schemas.microsoft.com/office/drawing/2016/5/14/chartex" xmlns:mc="http://schemas.openxmlformats.org/markup-compatibility/2006" xmlns:m="http://schemas.openxmlformats.org/officeDocument/2006/math" xmlns:aink="http://schemas.microsoft.com/office/drawing/2016/ink" xmlns:am3d="http://schemas.microsoft.com/office/drawing/2017/model3d" xmlns:oel="http://schemas.microsoft.com/office/2019/extlst" xmlns:r="http://schemas.openxmlformats.org/officeDocument/2006/relationships" xmlns:wp14="http://schemas.microsoft.com/office/word/2010/wordprocessingDrawing" xmlns:wp="http://schemas.openxmlformats.org/drawingml/2006/wordprocessingDrawing" xmlns:wpg="http://schemas.microsoft.com/office/word/2010/wordprocessingGroup" xmlns:wpi="http://schemas.microsoft.com/office/word/2010/wordprocessingInk" xmlns:wps="http://schemas.microsoft.com/office/word/2010/wordprocessingShape" xmlns:o="urn:schemas-microsoft-com:office:office" xmlns:v="urn:schemas-microsoft-com:vml" xmlns:w10="urn:schemas-microsoft-com:office:word" xmlns:w="http://schemas.openxmlformats.org/wordprocessingml/2006/main" xmlns:w14="http://schemas.microsoft.com/office/word/2010/wordml" xmlns:w15="http://schemas.microsoft.com/office/word/2012/wordml" xmlns:w16cex="http://schemas.microsoft.com/office/word/2018/wordml/cex" xmlns:w16cid="http://schemas.microsoft.com/office/word/2016/wordml/cid" xmlns:w16="http://schemas.microsoft.com/office/word/2018/wordml" xmlns:w16sdtdh="http://schemas.microsoft.com/office/word/2020/wordml/sdtdatahash" xmlns:w16sdtfl="http://schemas.microsoft.com/office/word/2024/wordml/sdtformatlock" xmlns:w16se="http://schemas.microsoft.com/office/word/2015/wordml/symex" xmlns:w16du="http://schemas.microsoft.com/office/word/2023/wordml/word16du" xmlns:wne="http://schemas.microsoft.com/office/word/2006/wordml" mc:Ignorable="w14 w15 w16se w16cid w16 w16cex w16sdtdh w16sdtfl w16du wp14">
   <w:p>
     <w:pPr>
       <w:jc w:val="right"/>
@@ -419,8 +630,121 @@
 </file>
 
 <file path=word/numbering.xml><?xml version="1.0" encoding="utf-8"?>
-<w:numbering xmlns:wpc="http://schemas.microsoft.com/office/word/2010/wordprocessingCanvas" xmlns:cx="http://schemas.microsoft.com/office/drawing/2014/chartex" xmlns:cx1="http://schemas.microsoft.com/office/drawing/2015/9/8/chartex" xmlns:cx2="http://schemas.microsoft.com/office/drawing/2015/10/21/chartex" xmlns:cx3="http://schemas.microsoft.com/office/drawing/2016/5/9/chartex" xmlns:cx4="http://schemas.microsoft.com/office/drawing/2016/5/10/chartex" xmlns:cx5="http://schemas.microsoft.com/office/drawing/2016/5/11/chartex" xmlns:cx6="http://schemas.microsoft.com/office/drawing/2016/5/12/chartex" xmlns:cx7="http://schemas.microsoft.com/office/drawing/2016/5/13/chartex" xmlns:cx8="http://schemas.microsoft.com/office/drawing/2016/5/14/chartex" xmlns:mc="http://schemas.openxmlformats.org/markup-compatibility/2006" xmlns:aink="http://schemas.microsoft.com/office/drawing/2016/ink" xmlns:am3d="http://schemas.microsoft.com/office/drawing/2017/model3d" xmlns:o="urn:schemas-microsoft-com:office:office" xmlns:oel="http://schemas.microsoft.com/office/2019/extlst" xmlns:r="http://schemas.openxmlformats.org/officeDocument/2006/relationships" xmlns:m="http://schemas.openxmlformats.org/officeDocument/2006/math" xmlns:v="urn:schemas-microsoft-com:vml" xmlns:wp14="http://schemas.microsoft.com/office/word/2010/wordprocessingDrawing" xmlns:wp="http://schemas.openxmlformats.org/drawingml/2006/wordprocessingDrawing" xmlns:w10="urn:schemas-microsoft-com:office:word" xmlns:w="http://schemas.openxmlformats.org/wordprocessingml/2006/main" xmlns:w14="http://schemas.microsoft.com/office/word/2010/wordml" xmlns:w15="http://schemas.microsoft.com/office/word/2012/wordml" xmlns:w16cex="http://schemas.microsoft.com/office/word/2018/wordml/cex" xmlns:w16cid="http://schemas.microsoft.com/office/word/2016/wordml/cid" xmlns:w16="http://schemas.microsoft.com/office/word/2018/wordml" xmlns:w16du="http://schemas.microsoft.com/office/word/2023/wordml/word16du" xmlns:w16sdtdh="http://schemas.microsoft.com/office/word/2020/wordml/sdtdatahash" xmlns:w16sdtfl="http://schemas.microsoft.com/office/word/2024/wordml/sdtformatlock" xmlns:w16se="http://schemas.microsoft.com/office/word/2015/wordml/symex" xmlns:wpg="http://schemas.microsoft.com/office/word/2010/wordprocessingGroup" xmlns:wpi="http://schemas.microsoft.com/office/word/2010/wordprocessingInk" xmlns:wne="http://schemas.microsoft.com/office/word/2006/wordml" xmlns:wps="http://schemas.microsoft.com/office/word/2010/wordprocessingShape" mc:Ignorable="w14 w15 w16se w16cid w16 w16cex w16sdtdh w16sdtfl w16du wp14">
+<w:numbering xmlns:wpc="http://schemas.microsoft.com/office/word/2010/wordprocessingCanvas" xmlns:cx="http://schemas.microsoft.com/office/drawing/2014/chartex" xmlns:cx1="http://schemas.microsoft.com/office/drawing/2015/9/8/chartex" xmlns:cx2="http://schemas.microsoft.com/office/drawing/2015/10/21/chartex" xmlns:cx3="http://schemas.microsoft.com/office/drawing/2016/5/9/chartex" xmlns:cx4="http://schemas.microsoft.com/office/drawing/2016/5/10/chartex" xmlns:cx5="http://schemas.microsoft.com/office/drawing/2016/5/11/chartex" xmlns:cx6="http://schemas.microsoft.com/office/drawing/2016/5/12/chartex" xmlns:cx7="http://schemas.microsoft.com/office/drawing/2016/5/13/chartex" xmlns:cx8="http://schemas.microsoft.com/office/drawing/2016/5/14/chartex" xmlns:mc="http://schemas.openxmlformats.org/markup-compatibility/2006" xmlns:m="http://schemas.openxmlformats.org/officeDocument/2006/math" xmlns:aink="http://schemas.microsoft.com/office/drawing/2016/ink" xmlns:am3d="http://schemas.microsoft.com/office/drawing/2017/model3d" xmlns:oel="http://schemas.microsoft.com/office/2019/extlst" xmlns:r="http://schemas.openxmlformats.org/officeDocument/2006/relationships" xmlns:wp14="http://schemas.microsoft.com/office/word/2010/wordprocessingDrawing" xmlns:wp="http://schemas.openxmlformats.org/drawingml/2006/wordprocessingDrawing" xmlns:wpg="http://schemas.microsoft.com/office/word/2010/wordprocessingGroup" xmlns:wpi="http://schemas.microsoft.com/office/word/2010/wordprocessingInk" xmlns:wps="http://schemas.microsoft.com/office/word/2010/wordprocessingShape" xmlns:o="urn:schemas-microsoft-com:office:office" xmlns:v="urn:schemas-microsoft-com:vml" xmlns:w10="urn:schemas-microsoft-com:office:word" xmlns:w="http://schemas.openxmlformats.org/wordprocessingml/2006/main" xmlns:w14="http://schemas.microsoft.com/office/word/2010/wordml" xmlns:w15="http://schemas.microsoft.com/office/word/2012/wordml" xmlns:w16cex="http://schemas.microsoft.com/office/word/2018/wordml/cex" xmlns:w16cid="http://schemas.microsoft.com/office/word/2016/wordml/cid" xmlns:w16="http://schemas.microsoft.com/office/word/2018/wordml" xmlns:w16sdtdh="http://schemas.microsoft.com/office/word/2020/wordml/sdtdatahash" xmlns:w16sdtfl="http://schemas.microsoft.com/office/word/2024/wordml/sdtformatlock" xmlns:w16se="http://schemas.microsoft.com/office/word/2015/wordml/symex" xmlns:w16du="http://schemas.microsoft.com/office/word/2023/wordml/word16du" xmlns:wne="http://schemas.microsoft.com/office/word/2006/wordml" mc:Ignorable="w14 w15 w16se w16cid w16 w16cex w16sdtdh w16sdtfl w16du wp14">
   <w:abstractNum w:abstractNumId="0" w15:restartNumberingAfterBreak="0">
+    <w:nsid w:val="6BBC5EF9"/>
+    <w:multiLevelType w:val="hybridMultilevel"/>
+    <w:tmpl w:val="8A566C18"/>
+    <w:lvl w:ilvl="0" w:tplc="08090001">
+      <w:start w:val="1"/>
+      <w:numFmt w:val="bullet"/>
+      <w:lvlText w:val=""/>
+      <w:lvlJc w:val="left"/>
+      <w:pPr>
+        <w:ind w:left="1429" w:hanging="360"/>
+      </w:pPr>
+      <w:rPr>
+        <w:rFonts w:ascii="Symbol" w:hAnsi="Symbol" w:hint="default"/>
+      </w:rPr>
+    </w:lvl>
+    <w:lvl w:ilvl="1" w:tplc="08090003" w:tentative="1">
+      <w:start w:val="1"/>
+      <w:numFmt w:val="bullet"/>
+      <w:lvlText w:val="o"/>
+      <w:lvlJc w:val="left"/>
+      <w:pPr>
+        <w:ind w:left="2149" w:hanging="360"/>
+      </w:pPr>
+      <w:rPr>
+        <w:rFonts w:ascii="Courier New" w:hAnsi="Courier New" w:cs="Courier New" w:hint="default"/>
+      </w:rPr>
+    </w:lvl>
+    <w:lvl w:ilvl="2" w:tplc="08090005" w:tentative="1">
+      <w:start w:val="1"/>
+      <w:numFmt w:val="bullet"/>
+      <w:lvlText w:val=""/>
+      <w:lvlJc w:val="left"/>
+      <w:pPr>
+        <w:ind w:left="2869" w:hanging="360"/>
+      </w:pPr>
+      <w:rPr>
+        <w:rFonts w:ascii="Wingdings" w:hAnsi="Wingdings" w:hint="default"/>
+      </w:rPr>
+    </w:lvl>
+    <w:lvl w:ilvl="3" w:tplc="08090001" w:tentative="1">
+      <w:start w:val="1"/>
+      <w:numFmt w:val="bullet"/>
+      <w:lvlText w:val=""/>
+      <w:lvlJc w:val="left"/>
+      <w:pPr>
+        <w:ind w:left="3589" w:hanging="360"/>
+      </w:pPr>
+      <w:rPr>
+        <w:rFonts w:ascii="Symbol" w:hAnsi="Symbol" w:hint="default"/>
+      </w:rPr>
+    </w:lvl>
+    <w:lvl w:ilvl="4" w:tplc="08090003" w:tentative="1">
+      <w:start w:val="1"/>
+      <w:numFmt w:val="bullet"/>
+      <w:lvlText w:val="o"/>
+      <w:lvlJc w:val="left"/>
+      <w:pPr>
+        <w:ind w:left="4309" w:hanging="360"/>
+      </w:pPr>
+      <w:rPr>
+        <w:rFonts w:ascii="Courier New" w:hAnsi="Courier New" w:cs="Courier New" w:hint="default"/>
+      </w:rPr>
+    </w:lvl>
+    <w:lvl w:ilvl="5" w:tplc="08090005" w:tentative="1">
+      <w:start w:val="1"/>
+      <w:numFmt w:val="bullet"/>
+      <w:lvlText w:val=""/>
+      <w:lvlJc w:val="left"/>
+      <w:pPr>
+        <w:ind w:left="5029" w:hanging="360"/>
+      </w:pPr>
+      <w:rPr>
+        <w:rFonts w:ascii="Wingdings" w:hAnsi="Wingdings" w:hint="default"/>
+      </w:rPr>
+    </w:lvl>
+    <w:lvl w:ilvl="6" w:tplc="08090001" w:tentative="1">
+      <w:start w:val="1"/>
+      <w:numFmt w:val="bullet"/>
+      <w:lvlText w:val=""/>
+      <w:lvlJc w:val="left"/>
+      <w:pPr>
+        <w:ind w:left="5749" w:hanging="360"/>
+      </w:pPr>
+      <w:rPr>
+        <w:rFonts w:ascii="Symbol" w:hAnsi="Symbol" w:hint="default"/>
+      </w:rPr>
+    </w:lvl>
+    <w:lvl w:ilvl="7" w:tplc="08090003" w:tentative="1">
+      <w:start w:val="1"/>
+      <w:numFmt w:val="bullet"/>
+      <w:lvlText w:val="o"/>
+      <w:lvlJc w:val="left"/>
+      <w:pPr>
+        <w:ind w:left="6469" w:hanging="360"/>
+      </w:pPr>
+      <w:rPr>
+        <w:rFonts w:ascii="Courier New" w:hAnsi="Courier New" w:cs="Courier New" w:hint="default"/>
+      </w:rPr>
+    </w:lvl>
+    <w:lvl w:ilvl="8" w:tplc="08090005" w:tentative="1">
+      <w:start w:val="1"/>
+      <w:numFmt w:val="bullet"/>
+      <w:lvlText w:val=""/>
+      <w:lvlJc w:val="left"/>
+      <w:pPr>
+        <w:ind w:left="7189" w:hanging="360"/>
+      </w:pPr>
+      <w:rPr>
+        <w:rFonts w:ascii="Wingdings" w:hAnsi="Wingdings" w:hint="default"/>
+      </w:rPr>
+    </w:lvl>
+  </w:abstractNum>
+  <w:abstractNum w:abstractNumId="1" w15:restartNumberingAfterBreak="0">
     <w:nsid w:val="76821C1E"/>
     <w:multiLevelType w:val="multilevel"/>
     <w:tmpl w:val="E4482EB0"/>
@@ -534,13 +858,16 @@
     </w:lvl>
   </w:abstractNum>
   <w:num w:numId="1" w16cid:durableId="1136025288">
+    <w:abstractNumId w:val="1"/>
+  </w:num>
+  <w:num w:numId="2" w16cid:durableId="1841388899">
     <w:abstractNumId w:val="0"/>
   </w:num>
 </w:numbering>
 </file>
 
 <file path=word/styles.xml><?xml version="1.0" encoding="utf-8"?>
-<w:styles xmlns:mc="http://schemas.openxmlformats.org/markup-compatibility/2006" xmlns:r="http://schemas.openxmlformats.org/officeDocument/2006/relationships" xmlns:w="http://schemas.openxmlformats.org/wordprocessingml/2006/main" xmlns:w14="http://schemas.microsoft.com/office/word/2010/wordml" xmlns:w15="http://schemas.microsoft.com/office/word/2012/wordml" xmlns:w16cex="http://schemas.microsoft.com/office/word/2018/wordml/cex" xmlns:w16cid="http://schemas.microsoft.com/office/word/2016/wordml/cid" xmlns:w16="http://schemas.microsoft.com/office/word/2018/wordml" xmlns:w16du="http://schemas.microsoft.com/office/word/2023/wordml/word16du" xmlns:w16sdtdh="http://schemas.microsoft.com/office/word/2020/wordml/sdtdatahash" xmlns:w16sdtfl="http://schemas.microsoft.com/office/word/2024/wordml/sdtformatlock" xmlns:w16se="http://schemas.microsoft.com/office/word/2015/wordml/symex" mc:Ignorable="w14 w15 w16se w16cid w16 w16cex w16sdtdh w16sdtfl w16du">
+<w:styles xmlns:mc="http://schemas.openxmlformats.org/markup-compatibility/2006" xmlns:r="http://schemas.openxmlformats.org/officeDocument/2006/relationships" xmlns:w="http://schemas.openxmlformats.org/wordprocessingml/2006/main" xmlns:w14="http://schemas.microsoft.com/office/word/2010/wordml" xmlns:w15="http://schemas.microsoft.com/office/word/2012/wordml" xmlns:w16cex="http://schemas.microsoft.com/office/word/2018/wordml/cex" xmlns:w16cid="http://schemas.microsoft.com/office/word/2016/wordml/cid" xmlns:w16="http://schemas.microsoft.com/office/word/2018/wordml" xmlns:w16sdtdh="http://schemas.microsoft.com/office/word/2020/wordml/sdtdatahash" xmlns:w16sdtfl="http://schemas.microsoft.com/office/word/2024/wordml/sdtformatlock" xmlns:w16se="http://schemas.microsoft.com/office/word/2015/wordml/symex" xmlns:w16du="http://schemas.microsoft.com/office/word/2023/wordml/word16du" mc:Ignorable="w14 w15 w16se w16cid w16 w16cex w16sdtdh w16sdtfl w16du">
   <w:docDefaults>
     <w:rPrDefault>
       <w:rPr>
@@ -936,7 +1263,7 @@
     <w:lsdException w:name="Unresolved Mention" w:semiHidden="1" w:unhideWhenUsed="1"/>
     <w:lsdException w:name="Smart Link" w:semiHidden="1" w:unhideWhenUsed="1"/>
   </w:latentStyles>
-  <w:style w:type="paragraph" w:default="1" w:styleId="Normlny">
+  <w:style w:type="paragraph" w:default="1" w:styleId="Normal">
     <w:name w:val="Normal"/>
     <w:qFormat/>
     <w:rPr>
@@ -944,12 +1271,13 @@
       <w:lang w:val="sk-SK"/>
     </w:rPr>
   </w:style>
-  <w:style w:type="character" w:default="1" w:styleId="Predvolenpsmoodseku">
+  <w:style w:type="character" w:default="1" w:styleId="DefaultParagraphFont">
     <w:name w:val="Default Paragraph Font"/>
     <w:uiPriority w:val="1"/>
+    <w:semiHidden/>
     <w:unhideWhenUsed/>
   </w:style>
-  <w:style w:type="table" w:default="1" w:styleId="Normlnatabuka">
+  <w:style w:type="table" w:default="1" w:styleId="TableNormal">
     <w:name w:val="Normal Table"/>
     <w:uiPriority w:val="99"/>
     <w:semiHidden/>
@@ -964,14 +1292,14 @@
       </w:tblCellMar>
     </w:tblPr>
   </w:style>
-  <w:style w:type="numbering" w:default="1" w:styleId="Bezzoznamu">
+  <w:style w:type="numbering" w:default="1" w:styleId="NoList">
     <w:name w:val="No List"/>
     <w:uiPriority w:val="99"/>
     <w:semiHidden/>
     <w:unhideWhenUsed/>
   </w:style>
-  <w:style w:type="table" w:customStyle="1" w:styleId="TableNormal">
-    <w:name w:val="Table Normal"/>
+  <w:style w:type="table" w:customStyle="1" w:styleId="TableNormal1">
+    <w:name w:val="Table Normal1"/>
     <w:uiPriority w:val="2"/>
     <w:semiHidden/>
     <w:unhideWhenUsed/>
@@ -986,9 +1314,9 @@
       </w:tblCellMar>
     </w:tblPr>
   </w:style>
-  <w:style w:type="paragraph" w:styleId="Zkladntext">
+  <w:style w:type="paragraph" w:styleId="BodyText">
     <w:name w:val="Body Text"/>
-    <w:basedOn w:val="Normlny"/>
+    <w:basedOn w:val="Normal"/>
     <w:uiPriority w:val="1"/>
     <w:qFormat/>
     <w:rPr>
@@ -998,21 +1326,21 @@
       <w:szCs w:val="36"/>
     </w:rPr>
   </w:style>
-  <w:style w:type="paragraph" w:styleId="Odsekzoznamu">
+  <w:style w:type="paragraph" w:styleId="ListParagraph">
     <w:name w:val="List Paragraph"/>
-    <w:basedOn w:val="Normlny"/>
+    <w:basedOn w:val="Normal"/>
     <w:uiPriority w:val="1"/>
     <w:qFormat/>
   </w:style>
   <w:style w:type="paragraph" w:customStyle="1" w:styleId="TableParagraph">
     <w:name w:val="Table Paragraph"/>
-    <w:basedOn w:val="Normlny"/>
+    <w:basedOn w:val="Normal"/>
     <w:uiPriority w:val="1"/>
     <w:qFormat/>
   </w:style>
   <w:style w:type="paragraph" w:customStyle="1" w:styleId="SPtext">
     <w:name w:val="SP_text"/>
-    <w:basedOn w:val="Normlny"/>
+    <w:basedOn w:val="Normal"/>
     <w:link w:val="SPtextChar"/>
     <w:qFormat/>
     <w:rsid w:val="00514F22"/>
@@ -1039,7 +1367,7 @@
   </w:style>
   <w:style w:type="character" w:customStyle="1" w:styleId="SPtextChar">
     <w:name w:val="SP_text Char"/>
-    <w:basedOn w:val="Predvolenpsmoodseku"/>
+    <w:basedOn w:val="DefaultParagraphFont"/>
     <w:link w:val="SPtext"/>
     <w:rsid w:val="00514F22"/>
     <w:rPr>
@@ -1224,10 +1552,10 @@
       <w:lang w:val="sk-SK"/>
     </w:rPr>
   </w:style>
-  <w:style w:type="paragraph" w:styleId="Hlavika">
+  <w:style w:type="paragraph" w:styleId="Header">
     <w:name w:val="header"/>
-    <w:basedOn w:val="Normlny"/>
-    <w:link w:val="HlavikaChar"/>
+    <w:basedOn w:val="Normal"/>
+    <w:link w:val="HeaderChar"/>
     <w:uiPriority w:val="99"/>
     <w:unhideWhenUsed/>
     <w:rsid w:val="00551B87"/>
@@ -1238,10 +1566,10 @@
       </w:tabs>
     </w:pPr>
   </w:style>
-  <w:style w:type="character" w:customStyle="1" w:styleId="HlavikaChar">
-    <w:name w:val="Hlavička Char"/>
-    <w:basedOn w:val="Predvolenpsmoodseku"/>
-    <w:link w:val="Hlavika"/>
+  <w:style w:type="character" w:customStyle="1" w:styleId="HeaderChar">
+    <w:name w:val="Header Char"/>
+    <w:basedOn w:val="DefaultParagraphFont"/>
+    <w:link w:val="Header"/>
     <w:uiPriority w:val="99"/>
     <w:rsid w:val="00551B87"/>
     <w:rPr>
@@ -1249,10 +1577,10 @@
       <w:lang w:val="sk-SK"/>
     </w:rPr>
   </w:style>
-  <w:style w:type="paragraph" w:styleId="Pta">
+  <w:style w:type="paragraph" w:styleId="Footer">
     <w:name w:val="footer"/>
-    <w:basedOn w:val="Normlny"/>
-    <w:link w:val="PtaChar"/>
+    <w:basedOn w:val="Normal"/>
+    <w:link w:val="FooterChar"/>
     <w:uiPriority w:val="99"/>
     <w:unhideWhenUsed/>
     <w:rsid w:val="00551B87"/>
@@ -1263,10 +1591,10 @@
       </w:tabs>
     </w:pPr>
   </w:style>
-  <w:style w:type="character" w:customStyle="1" w:styleId="PtaChar">
-    <w:name w:val="Päta Char"/>
-    <w:basedOn w:val="Predvolenpsmoodseku"/>
-    <w:link w:val="Pta"/>
+  <w:style w:type="character" w:customStyle="1" w:styleId="FooterChar">
+    <w:name w:val="Footer Char"/>
+    <w:basedOn w:val="DefaultParagraphFont"/>
+    <w:link w:val="Footer"/>
     <w:uiPriority w:val="99"/>
     <w:rsid w:val="00551B87"/>
     <w:rPr>

</xml_diff>